<commit_message>
Finalize report with MLflow CI CD Kubernetes and monitoring evidence
</commit_message>
<xml_diff>
--- a/report/REPORT.docx
+++ b/report/REPORT.docx
@@ -1102,6 +1102,106 @@
     </w:p>
     <w:p>
       <w:pPr>
+        <w:jc w:val="center"/>
+      </w:pPr>
+      <w:r>
+        <w:drawing>
+          <wp:inline xmlns:a="http://schemas.openxmlformats.org/drawingml/2006/main" xmlns:pic="http://schemas.openxmlformats.org/drawingml/2006/picture">
+            <wp:extent cx="5303520" cy="4607043"/>
+            <wp:docPr id="6" name="Picture 6"/>
+            <wp:cNvGraphicFramePr>
+              <a:graphicFrameLocks noChangeAspect="1"/>
+            </wp:cNvGraphicFramePr>
+            <a:graphic>
+              <a:graphicData uri="http://schemas.openxmlformats.org/drawingml/2006/picture">
+                <pic:pic>
+                  <pic:nvPicPr>
+                    <pic:cNvPr id="0" name="09_mlflow_metrics.png"/>
+                    <pic:cNvPicPr/>
+                  </pic:nvPicPr>
+                  <pic:blipFill>
+                    <a:blip r:embed="rId14"/>
+                    <a:stretch>
+                      <a:fillRect/>
+                    </a:stretch>
+                  </pic:blipFill>
+                  <pic:spPr>
+                    <a:xfrm>
+                      <a:off x="0" y="0"/>
+                      <a:ext cx="5303520" cy="4607043"/>
+                    </a:xfrm>
+                    <a:prstGeom prst="rect"/>
+                  </pic:spPr>
+                </pic:pic>
+              </a:graphicData>
+            </a:graphic>
+          </wp:inline>
+        </w:drawing>
+      </w:r>
+    </w:p>
+    <w:p>
+      <w:pPr>
+        <w:jc w:val="center"/>
+      </w:pPr>
+      <w:r>
+        <w:rPr>
+          <w:i/>
+        </w:rPr>
+        <w:t>MLflow experiment metrics</w:t>
+      </w:r>
+    </w:p>
+    <w:p>
+      <w:pPr>
+        <w:jc w:val="center"/>
+      </w:pPr>
+      <w:r>
+        <w:drawing>
+          <wp:inline xmlns:a="http://schemas.openxmlformats.org/drawingml/2006/main" xmlns:pic="http://schemas.openxmlformats.org/drawingml/2006/picture">
+            <wp:extent cx="5303520" cy="2968097"/>
+            <wp:docPr id="7" name="Picture 7"/>
+            <wp:cNvGraphicFramePr>
+              <a:graphicFrameLocks noChangeAspect="1"/>
+            </wp:cNvGraphicFramePr>
+            <a:graphic>
+              <a:graphicData uri="http://schemas.openxmlformats.org/drawingml/2006/picture">
+                <pic:pic>
+                  <pic:nvPicPr>
+                    <pic:cNvPr id="0" name="10_mlflow_parameters.png"/>
+                    <pic:cNvPicPr/>
+                  </pic:nvPicPr>
+                  <pic:blipFill>
+                    <a:blip r:embed="rId15"/>
+                    <a:stretch>
+                      <a:fillRect/>
+                    </a:stretch>
+                  </pic:blipFill>
+                  <pic:spPr>
+                    <a:xfrm>
+                      <a:off x="0" y="0"/>
+                      <a:ext cx="5303520" cy="2968097"/>
+                    </a:xfrm>
+                    <a:prstGeom prst="rect"/>
+                  </pic:spPr>
+                </pic:pic>
+              </a:graphicData>
+            </a:graphic>
+          </wp:inline>
+        </w:drawing>
+      </w:r>
+    </w:p>
+    <w:p>
+      <w:pPr>
+        <w:jc w:val="center"/>
+      </w:pPr>
+      <w:r>
+        <w:rPr>
+          <w:i/>
+        </w:rPr>
+        <w:t>MLflow tracked parameters</w:t>
+      </w:r>
+    </w:p>
+    <w:p>
+      <w:pPr>
         <w:pStyle w:val="Heading1"/>
       </w:pPr>
       <w:r>
@@ -1167,6 +1267,56 @@
     </w:p>
     <w:p>
       <w:pPr>
+        <w:jc w:val="center"/>
+      </w:pPr>
+      <w:r>
+        <w:drawing>
+          <wp:inline xmlns:a="http://schemas.openxmlformats.org/drawingml/2006/main" xmlns:pic="http://schemas.openxmlformats.org/drawingml/2006/picture">
+            <wp:extent cx="5303520" cy="2540982"/>
+            <wp:docPr id="8" name="Picture 8"/>
+            <wp:cNvGraphicFramePr>
+              <a:graphicFrameLocks noChangeAspect="1"/>
+            </wp:cNvGraphicFramePr>
+            <a:graphic>
+              <a:graphicData uri="http://schemas.openxmlformats.org/drawingml/2006/picture">
+                <pic:pic>
+                  <pic:nvPicPr>
+                    <pic:cNvPr id="0" name="01_github_actions.png"/>
+                    <pic:cNvPicPr/>
+                  </pic:nvPicPr>
+                  <pic:blipFill>
+                    <a:blip r:embed="rId16"/>
+                    <a:stretch>
+                      <a:fillRect/>
+                    </a:stretch>
+                  </pic:blipFill>
+                  <pic:spPr>
+                    <a:xfrm>
+                      <a:off x="0" y="0"/>
+                      <a:ext cx="5303520" cy="2540982"/>
+                    </a:xfrm>
+                    <a:prstGeom prst="rect"/>
+                  </pic:spPr>
+                </pic:pic>
+              </a:graphicData>
+            </a:graphic>
+          </wp:inline>
+        </w:drawing>
+      </w:r>
+    </w:p>
+    <w:p>
+      <w:pPr>
+        <w:jc w:val="center"/>
+      </w:pPr>
+      <w:r>
+        <w:rPr>
+          <w:i/>
+        </w:rPr>
+        <w:t>Successful GitHub Actions CI/CD workflow</w:t>
+      </w:r>
+    </w:p>
+    <w:p>
+      <w:pPr>
         <w:pStyle w:val="Heading1"/>
       </w:pPr>
       <w:r>
@@ -1208,6 +1358,106 @@
     </w:p>
     <w:p>
       <w:pPr>
+        <w:jc w:val="center"/>
+      </w:pPr>
+      <w:r>
+        <w:drawing>
+          <wp:inline xmlns:a="http://schemas.openxmlformats.org/drawingml/2006/main" xmlns:pic="http://schemas.openxmlformats.org/drawingml/2006/picture">
+            <wp:extent cx="5303520" cy="2031086"/>
+            <wp:docPr id="9" name="Picture 9"/>
+            <wp:cNvGraphicFramePr>
+              <a:graphicFrameLocks noChangeAspect="1"/>
+            </wp:cNvGraphicFramePr>
+            <a:graphic>
+              <a:graphicData uri="http://schemas.openxmlformats.org/drawingml/2006/picture">
+                <pic:pic>
+                  <pic:nvPicPr>
+                    <pic:cNvPr id="0" name="04_kubernetes.png"/>
+                    <pic:cNvPicPr/>
+                  </pic:nvPicPr>
+                  <pic:blipFill>
+                    <a:blip r:embed="rId17"/>
+                    <a:stretch>
+                      <a:fillRect/>
+                    </a:stretch>
+                  </pic:blipFill>
+                  <pic:spPr>
+                    <a:xfrm>
+                      <a:off x="0" y="0"/>
+                      <a:ext cx="5303520" cy="2031086"/>
+                    </a:xfrm>
+                    <a:prstGeom prst="rect"/>
+                  </pic:spPr>
+                </pic:pic>
+              </a:graphicData>
+            </a:graphic>
+          </wp:inline>
+        </w:drawing>
+      </w:r>
+    </w:p>
+    <w:p>
+      <w:pPr>
+        <w:jc w:val="center"/>
+      </w:pPr>
+      <w:r>
+        <w:rPr>
+          <w:i/>
+        </w:rPr>
+        <w:t>Kubernetes deployment and pod status</w:t>
+      </w:r>
+    </w:p>
+    <w:p>
+      <w:pPr>
+        <w:jc w:val="center"/>
+      </w:pPr>
+      <w:r>
+        <w:drawing>
+          <wp:inline xmlns:a="http://schemas.openxmlformats.org/drawingml/2006/main" xmlns:pic="http://schemas.openxmlformats.org/drawingml/2006/picture">
+            <wp:extent cx="5303520" cy="2489644"/>
+            <wp:docPr id="10" name="Picture 10"/>
+            <wp:cNvGraphicFramePr>
+              <a:graphicFrameLocks noChangeAspect="1"/>
+            </wp:cNvGraphicFramePr>
+            <a:graphic>
+              <a:graphicData uri="http://schemas.openxmlformats.org/drawingml/2006/picture">
+                <pic:pic>
+                  <pic:nvPicPr>
+                    <pic:cNvPr id="0" name="05_kubernetes_api_test.png"/>
+                    <pic:cNvPicPr/>
+                  </pic:nvPicPr>
+                  <pic:blipFill>
+                    <a:blip r:embed="rId18"/>
+                    <a:stretch>
+                      <a:fillRect/>
+                    </a:stretch>
+                  </pic:blipFill>
+                  <pic:spPr>
+                    <a:xfrm>
+                      <a:off x="0" y="0"/>
+                      <a:ext cx="5303520" cy="2489644"/>
+                    </a:xfrm>
+                    <a:prstGeom prst="rect"/>
+                  </pic:spPr>
+                </pic:pic>
+              </a:graphicData>
+            </a:graphic>
+          </wp:inline>
+        </w:drawing>
+      </w:r>
+    </w:p>
+    <w:p>
+      <w:pPr>
+        <w:jc w:val="center"/>
+      </w:pPr>
+      <w:r>
+        <w:rPr>
+          <w:i/>
+        </w:rPr>
+        <w:t>Kubernetes API smoke-test results</w:t>
+      </w:r>
+    </w:p>
+    <w:p>
+      <w:pPr>
         <w:pStyle w:val="Heading1"/>
       </w:pPr>
       <w:r>
@@ -1245,6 +1495,106 @@
     </w:p>
     <w:p>
       <w:pPr>
+        <w:jc w:val="center"/>
+      </w:pPr>
+      <w:r>
+        <w:drawing>
+          <wp:inline xmlns:a="http://schemas.openxmlformats.org/drawingml/2006/main" xmlns:pic="http://schemas.openxmlformats.org/drawingml/2006/picture">
+            <wp:extent cx="5303520" cy="1594828"/>
+            <wp:docPr id="11" name="Picture 11"/>
+            <wp:cNvGraphicFramePr>
+              <a:graphicFrameLocks noChangeAspect="1"/>
+            </wp:cNvGraphicFramePr>
+            <a:graphic>
+              <a:graphicData uri="http://schemas.openxmlformats.org/drawingml/2006/picture">
+                <pic:pic>
+                  <pic:nvPicPr>
+                    <pic:cNvPr id="0" name="07_prometheus.png"/>
+                    <pic:cNvPicPr/>
+                  </pic:nvPicPr>
+                  <pic:blipFill>
+                    <a:blip r:embed="rId19"/>
+                    <a:stretch>
+                      <a:fillRect/>
+                    </a:stretch>
+                  </pic:blipFill>
+                  <pic:spPr>
+                    <a:xfrm>
+                      <a:off x="0" y="0"/>
+                      <a:ext cx="5303520" cy="1594828"/>
+                    </a:xfrm>
+                    <a:prstGeom prst="rect"/>
+                  </pic:spPr>
+                </pic:pic>
+              </a:graphicData>
+            </a:graphic>
+          </wp:inline>
+        </w:drawing>
+      </w:r>
+    </w:p>
+    <w:p>
+      <w:pPr>
+        <w:jc w:val="center"/>
+      </w:pPr>
+      <w:r>
+        <w:rPr>
+          <w:i/>
+        </w:rPr>
+        <w:t>Prometheus API monitoring target</w:t>
+      </w:r>
+    </w:p>
+    <w:p>
+      <w:pPr>
+        <w:jc w:val="center"/>
+      </w:pPr>
+      <w:r>
+        <w:drawing>
+          <wp:inline xmlns:a="http://schemas.openxmlformats.org/drawingml/2006/main" xmlns:pic="http://schemas.openxmlformats.org/drawingml/2006/picture">
+            <wp:extent cx="5303520" cy="2501519"/>
+            <wp:docPr id="12" name="Picture 12"/>
+            <wp:cNvGraphicFramePr>
+              <a:graphicFrameLocks noChangeAspect="1"/>
+            </wp:cNvGraphicFramePr>
+            <a:graphic>
+              <a:graphicData uri="http://schemas.openxmlformats.org/drawingml/2006/picture">
+                <pic:pic>
+                  <pic:nvPicPr>
+                    <pic:cNvPr id="0" name="08_grafana.png"/>
+                    <pic:cNvPicPr/>
+                  </pic:nvPicPr>
+                  <pic:blipFill>
+                    <a:blip r:embed="rId20"/>
+                    <a:stretch>
+                      <a:fillRect/>
+                    </a:stretch>
+                  </pic:blipFill>
+                  <pic:spPr>
+                    <a:xfrm>
+                      <a:off x="0" y="0"/>
+                      <a:ext cx="5303520" cy="2501519"/>
+                    </a:xfrm>
+                    <a:prstGeom prst="rect"/>
+                  </pic:spPr>
+                </pic:pic>
+              </a:graphicData>
+            </a:graphic>
+          </wp:inline>
+        </w:drawing>
+      </w:r>
+    </w:p>
+    <w:p>
+      <w:pPr>
+        <w:jc w:val="center"/>
+      </w:pPr>
+      <w:r>
+        <w:rPr>
+          <w:i/>
+        </w:rPr>
+        <w:t>Grafana API monitoring dashboard</w:t>
+      </w:r>
+    </w:p>
+    <w:p>
+      <w:pPr>
         <w:pStyle w:val="Heading1"/>
       </w:pPr>
       <w:r>
@@ -1259,7 +1609,7 @@
         <w:drawing>
           <wp:inline xmlns:a="http://schemas.openxmlformats.org/drawingml/2006/main" xmlns:pic="http://schemas.openxmlformats.org/drawingml/2006/picture">
             <wp:extent cx="5303520" cy="3193996"/>
-            <wp:docPr id="6" name="Picture 6"/>
+            <wp:docPr id="13" name="Picture 13"/>
             <wp:cNvGraphicFramePr>
               <a:graphicFrameLocks noChangeAspect="1"/>
             </wp:cNvGraphicFramePr>
@@ -1271,7 +1621,7 @@
                     <pic:cNvPicPr/>
                   </pic:nvPicPr>
                   <pic:blipFill>
-                    <a:blip r:embed="rId14"/>
+                    <a:blip r:embed="rId21"/>
                     <a:stretch>
                       <a:fillRect/>
                     </a:stretch>
@@ -1359,7 +1709,7 @@
       </w:r>
     </w:p>
     <w:sectPr>
-      <w:footerReference w:type="default" r:id="rId15"/>
+      <w:footerReference w:type="default" r:id="rId22"/>
       <w:pgSz w:w="12240" w:h="15840"/>
       <w:pgMar w:top="1008" w:right="1080" w:bottom="1008" w:left="1080" w:header="720" w:footer="720" w:gutter="0"/>
       <w:cols w:space="720"/>

</xml_diff>